<commit_message>
ran whole pipeline again
</commit_message>
<xml_diff>
--- a/manuscripts/table2.docx
+++ b/manuscripts/table2.docx
@@ -299,7 +299,7 @@
                 <w:rFonts w:ascii="Calibri" w:hAnsi="Calibri"/>
                 <w:sz w:val="20"/>
               </w:rPr>
-              <w:t xml:space="default">1.79 (1.32 - 2.42)</w:t>
+              <w:t xml:space="default">1.79 (1.33 - 2.41)</w:t>
             </w:r>
           </w:p>
         </w:tc>
@@ -347,7 +347,7 @@
                 <w:rFonts w:ascii="Calibri" w:hAnsi="Calibri"/>
                 <w:sz w:val="20"/>
               </w:rPr>
-              <w:t xml:space="default">0.99</w:t>
+              <w:t xml:space="default">1.00</w:t>
             </w:r>
           </w:p>
         </w:tc>
@@ -521,7 +521,7 @@
                 <w:rFonts w:ascii="Calibri" w:hAnsi="Calibri"/>
                 <w:sz w:val="20"/>
               </w:rPr>
-              <w:t xml:space="default">0.75</w:t>
+              <w:t xml:space="default">0.76</w:t>
             </w:r>
           </w:p>
         </w:tc>
@@ -839,7 +839,7 @@
                 <w:rFonts w:ascii="Calibri" w:hAnsi="Calibri"/>
                 <w:sz w:val="20"/>
               </w:rPr>
-              <w:t xml:space="default">1.09 (0.66 - 1.78)</w:t>
+              <w:t xml:space="default">1.09 (0.66 - 1.8)</w:t>
             </w:r>
           </w:p>
         </w:tc>
@@ -1187,55 +1187,55 @@
                 <w:rFonts w:ascii="Calibri" w:hAnsi="Calibri"/>
                 <w:sz w:val="20"/>
               </w:rPr>
-              <w:t xml:space="default">0.92 (0.62 - 1.36)</w:t>
-            </w:r>
-          </w:p>
-        </w:tc>
-        <w:tc>
-          <w:tcPr>
-            <w:tcBorders>
-              <w:top w:val="single" w:space="0" w:color="D3D3D3"/>
-              <w:bottom w:val="single" w:space="0" w:color="D3D3D3"/>
-              <w:start w:val="single" w:space="0" w:color="D3D3D3"/>
-              <w:end w:val="single" w:space="0" w:color="D3D3D3"/>
-            </w:tcBorders>
-          </w:tcPr>
-          <w:p>
-            <w:pPr>
-              <w:spacing w:before="0" w:after="60"/>
-              <w:keepNext/>
-              <w:jc w:val="start"/>
-            </w:pPr>
-            <w:r>
-              <w:rPr>
-                <w:rFonts w:ascii="Calibri" w:hAnsi="Calibri"/>
-                <w:sz w:val="20"/>
-              </w:rPr>
-              <w:t xml:space="default">0.34</w:t>
-            </w:r>
-          </w:p>
-        </w:tc>
-        <w:tc>
-          <w:tcPr>
-            <w:tcBorders>
-              <w:top w:val="single" w:space="0" w:color="D3D3D3"/>
-              <w:bottom w:val="single" w:space="0" w:color="D3D3D3"/>
-              <w:start w:val="single" w:space="0" w:color="D3D3D3"/>
-              <w:end w:val="single" w:space="0" w:color="D3D3D3"/>
-            </w:tcBorders>
-          </w:tcPr>
-          <w:p>
-            <w:pPr>
-              <w:spacing w:before="0" w:after="60"/>
-              <w:keepNext/>
-              <w:jc w:val="start"/>
-            </w:pPr>
-            <w:r>
-              <w:rPr>
-                <w:rFonts w:ascii="Calibri" w:hAnsi="Calibri"/>
-                <w:sz w:val="20"/>
-              </w:rPr>
-              <w:t xml:space="default">0.09</w:t>
+              <w:t xml:space="default">0.92 (0.63 - 1.39)</w:t>
+            </w:r>
+          </w:p>
+        </w:tc>
+        <w:tc>
+          <w:tcPr>
+            <w:tcBorders>
+              <w:top w:val="single" w:space="0" w:color="D3D3D3"/>
+              <w:bottom w:val="single" w:space="0" w:color="D3D3D3"/>
+              <w:start w:val="single" w:space="0" w:color="D3D3D3"/>
+              <w:end w:val="single" w:space="0" w:color="D3D3D3"/>
+            </w:tcBorders>
+          </w:tcPr>
+          <w:p>
+            <w:pPr>
+              <w:spacing w:before="0" w:after="60"/>
+              <w:keepNext/>
+              <w:jc w:val="start"/>
+            </w:pPr>
+            <w:r>
+              <w:rPr>
+                <w:rFonts w:ascii="Calibri" w:hAnsi="Calibri"/>
+                <w:sz w:val="20"/>
+              </w:rPr>
+              <w:t xml:space="default">0.35</w:t>
+            </w:r>
+          </w:p>
+        </w:tc>
+        <w:tc>
+          <w:tcPr>
+            <w:tcBorders>
+              <w:top w:val="single" w:space="0" w:color="D3D3D3"/>
+              <w:bottom w:val="single" w:space="0" w:color="D3D3D3"/>
+              <w:start w:val="single" w:space="0" w:color="D3D3D3"/>
+              <w:end w:val="single" w:space="0" w:color="D3D3D3"/>
+            </w:tcBorders>
+          </w:tcPr>
+          <w:p>
+            <w:pPr>
+              <w:spacing w:before="0" w:after="60"/>
+              <w:keepNext/>
+              <w:jc w:val="start"/>
+            </w:pPr>
+            <w:r>
+              <w:rPr>
+                <w:rFonts w:ascii="Calibri" w:hAnsi="Calibri"/>
+                <w:sz w:val="20"/>
+              </w:rPr>
+              <w:t xml:space="default">0.10</w:t>
             </w:r>
           </w:p>
         </w:tc>
@@ -1385,7 +1385,7 @@
                 <w:rFonts w:ascii="Calibri" w:hAnsi="Calibri"/>
                 <w:sz w:val="20"/>
               </w:rPr>
-              <w:t xml:space="default">0.57</w:t>
+              <w:t xml:space="default">0.55</w:t>
             </w:r>
           </w:p>
         </w:tc>

</xml_diff>

<commit_message>
ran models from desktop
</commit_message>
<xml_diff>
--- a/manuscripts/table2.docx
+++ b/manuscripts/table2.docx
@@ -299,7 +299,7 @@
                 <w:rFonts w:ascii="Calibri" w:hAnsi="Calibri"/>
                 <w:sz w:val="20"/>
               </w:rPr>
-              <w:t xml:space="default">1.56 (1.07 - 2.27)</w:t>
+              <w:t xml:space="default">1.57 (1.07 - 2.27)</w:t>
             </w:r>
           </w:p>
         </w:tc>
@@ -371,7 +371,7 @@
                 <w:rFonts w:ascii="Calibri" w:hAnsi="Calibri"/>
                 <w:sz w:val="20"/>
               </w:rPr>
-              <w:t xml:space="default">0.01</w:t>
+              <w:t xml:space="default">0.02</w:t>
             </w:r>
           </w:p>
         </w:tc>
@@ -473,7 +473,7 @@
                 <w:rFonts w:ascii="Calibri" w:hAnsi="Calibri"/>
                 <w:sz w:val="20"/>
               </w:rPr>
-              <w:t xml:space="default">1.34 (1.02 - 1.77)</w:t>
+              <w:t xml:space="default">1.34 (1.01 - 1.77)</w:t>
             </w:r>
           </w:p>
         </w:tc>
@@ -545,7 +545,7 @@
                 <w:rFonts w:ascii="Calibri" w:hAnsi="Calibri"/>
                 <w:sz w:val="20"/>
               </w:rPr>
-              <w:t xml:space="default">0.03</w:t>
+              <w:t xml:space="default">0.04</w:t>
             </w:r>
           </w:p>
         </w:tc>
@@ -665,79 +665,79 @@
                 <w:rFonts w:ascii="Calibri" w:hAnsi="Calibri"/>
                 <w:sz w:val="20"/>
               </w:rPr>
-              <w:t xml:space="default">0.94 (0.49 - 1.77)</w:t>
-            </w:r>
-          </w:p>
-        </w:tc>
-        <w:tc>
-          <w:tcPr>
-            <w:tcBorders>
-              <w:top w:val="single" w:space="0" w:color="D3D3D3"/>
-              <w:bottom w:val="single" w:space="0" w:color="D3D3D3"/>
-              <w:start w:val="single" w:space="0" w:color="D3D3D3"/>
-              <w:end w:val="single" w:space="0" w:color="D3D3D3"/>
-            </w:tcBorders>
-          </w:tcPr>
-          <w:p>
-            <w:pPr>
-              <w:spacing w:before="0" w:after="60"/>
-              <w:keepNext/>
-              <w:jc w:val="start"/>
-            </w:pPr>
-            <w:r>
-              <w:rPr>
-                <w:rFonts w:ascii="Calibri" w:hAnsi="Calibri"/>
-                <w:sz w:val="20"/>
-              </w:rPr>
-              <w:t xml:space="default">0.43</w:t>
-            </w:r>
-          </w:p>
-        </w:tc>
-        <w:tc>
-          <w:tcPr>
-            <w:tcBorders>
-              <w:top w:val="single" w:space="0" w:color="D3D3D3"/>
-              <w:bottom w:val="single" w:space="0" w:color="D3D3D3"/>
-              <w:start w:val="single" w:space="0" w:color="D3D3D3"/>
-              <w:end w:val="single" w:space="0" w:color="D3D3D3"/>
-            </w:tcBorders>
-          </w:tcPr>
-          <w:p>
-            <w:pPr>
-              <w:spacing w:before="0" w:after="60"/>
-              <w:keepNext/>
-              <w:jc w:val="start"/>
-            </w:pPr>
-            <w:r>
-              <w:rPr>
-                <w:rFonts w:ascii="Calibri" w:hAnsi="Calibri"/>
-                <w:sz w:val="20"/>
-              </w:rPr>
-              <w:t xml:space="default">0.23</w:t>
-            </w:r>
-          </w:p>
-        </w:tc>
-        <w:tc>
-          <w:tcPr>
-            <w:tcBorders>
-              <w:top w:val="single" w:space="0" w:color="D3D3D3"/>
-              <w:bottom w:val="single" w:space="0" w:color="D3D3D3"/>
-              <w:start w:val="single" w:space="0" w:color="D3D3D3"/>
-              <w:end w:val="single" w:space="0" w:color="D3D3D3"/>
-            </w:tcBorders>
-          </w:tcPr>
-          <w:p>
-            <w:pPr>
-              <w:spacing w:before="0" w:after="60"/>
-              <w:keepNext/>
-              <w:jc w:val="start"/>
-            </w:pPr>
-            <w:r>
-              <w:rPr>
-                <w:rFonts w:ascii="Calibri" w:hAnsi="Calibri"/>
-                <w:sz w:val="20"/>
-              </w:rPr>
-              <w:t xml:space="default">0.11</w:t>
+              <w:t xml:space="default">0.94 (0.5 - 1.75)</w:t>
+            </w:r>
+          </w:p>
+        </w:tc>
+        <w:tc>
+          <w:tcPr>
+            <w:tcBorders>
+              <w:top w:val="single" w:space="0" w:color="D3D3D3"/>
+              <w:bottom w:val="single" w:space="0" w:color="D3D3D3"/>
+              <w:start w:val="single" w:space="0" w:color="D3D3D3"/>
+              <w:end w:val="single" w:space="0" w:color="D3D3D3"/>
+            </w:tcBorders>
+          </w:tcPr>
+          <w:p>
+            <w:pPr>
+              <w:spacing w:before="0" w:after="60"/>
+              <w:keepNext/>
+              <w:jc w:val="start"/>
+            </w:pPr>
+            <w:r>
+              <w:rPr>
+                <w:rFonts w:ascii="Calibri" w:hAnsi="Calibri"/>
+                <w:sz w:val="20"/>
+              </w:rPr>
+              <w:t xml:space="default">0.42</w:t>
+            </w:r>
+          </w:p>
+        </w:tc>
+        <w:tc>
+          <w:tcPr>
+            <w:tcBorders>
+              <w:top w:val="single" w:space="0" w:color="D3D3D3"/>
+              <w:bottom w:val="single" w:space="0" w:color="D3D3D3"/>
+              <w:start w:val="single" w:space="0" w:color="D3D3D3"/>
+              <w:end w:val="single" w:space="0" w:color="D3D3D3"/>
+            </w:tcBorders>
+          </w:tcPr>
+          <w:p>
+            <w:pPr>
+              <w:spacing w:before="0" w:after="60"/>
+              <w:keepNext/>
+              <w:jc w:val="start"/>
+            </w:pPr>
+            <w:r>
+              <w:rPr>
+                <w:rFonts w:ascii="Calibri" w:hAnsi="Calibri"/>
+                <w:sz w:val="20"/>
+              </w:rPr>
+              <w:t xml:space="default">0.22</w:t>
+            </w:r>
+          </w:p>
+        </w:tc>
+        <w:tc>
+          <w:tcPr>
+            <w:tcBorders>
+              <w:top w:val="single" w:space="0" w:color="D3D3D3"/>
+              <w:bottom w:val="single" w:space="0" w:color="D3D3D3"/>
+              <w:start w:val="single" w:space="0" w:color="D3D3D3"/>
+              <w:end w:val="single" w:space="0" w:color="D3D3D3"/>
+            </w:tcBorders>
+          </w:tcPr>
+          <w:p>
+            <w:pPr>
+              <w:spacing w:before="0" w:after="60"/>
+              <w:keepNext/>
+              <w:jc w:val="start"/>
+            </w:pPr>
+            <w:r>
+              <w:rPr>
+                <w:rFonts w:ascii="Calibri" w:hAnsi="Calibri"/>
+                <w:sz w:val="20"/>
+              </w:rPr>
+              <w:t xml:space="default">0.12</w:t>
             </w:r>
           </w:p>
         </w:tc>
@@ -839,79 +839,79 @@
                 <w:rFonts w:ascii="Calibri" w:hAnsi="Calibri"/>
                 <w:sz w:val="20"/>
               </w:rPr>
-              <w:t xml:space="default">1.06 (0.63 - 1.75)</w:t>
-            </w:r>
-          </w:p>
-        </w:tc>
-        <w:tc>
-          <w:tcPr>
-            <w:tcBorders>
-              <w:top w:val="single" w:space="0" w:color="D3D3D3"/>
-              <w:bottom w:val="single" w:space="0" w:color="D3D3D3"/>
-              <w:start w:val="single" w:space="0" w:color="D3D3D3"/>
-              <w:end w:val="single" w:space="0" w:color="D3D3D3"/>
-            </w:tcBorders>
-          </w:tcPr>
-          <w:p>
-            <w:pPr>
-              <w:spacing w:before="0" w:after="60"/>
-              <w:keepNext/>
-              <w:jc w:val="start"/>
-            </w:pPr>
-            <w:r>
-              <w:rPr>
-                <w:rFonts w:ascii="Calibri" w:hAnsi="Calibri"/>
-                <w:sz w:val="20"/>
-              </w:rPr>
-              <w:t xml:space="default">0.59</w:t>
-            </w:r>
-          </w:p>
-        </w:tc>
-        <w:tc>
-          <w:tcPr>
-            <w:tcBorders>
-              <w:top w:val="single" w:space="0" w:color="D3D3D3"/>
-              <w:bottom w:val="single" w:space="0" w:color="D3D3D3"/>
-              <w:start w:val="single" w:space="0" w:color="D3D3D3"/>
-              <w:end w:val="single" w:space="0" w:color="D3D3D3"/>
-            </w:tcBorders>
-          </w:tcPr>
-          <w:p>
-            <w:pPr>
-              <w:spacing w:before="0" w:after="60"/>
-              <w:keepNext/>
-              <w:jc w:val="start"/>
-            </w:pPr>
-            <w:r>
-              <w:rPr>
-                <w:rFonts w:ascii="Calibri" w:hAnsi="Calibri"/>
-                <w:sz w:val="20"/>
-              </w:rPr>
-              <w:t xml:space="default">0.31</w:t>
-            </w:r>
-          </w:p>
-        </w:tc>
-        <w:tc>
-          <w:tcPr>
-            <w:tcBorders>
-              <w:top w:val="single" w:space="0" w:color="D3D3D3"/>
-              <w:bottom w:val="single" w:space="0" w:color="D3D3D3"/>
-              <w:start w:val="single" w:space="0" w:color="D3D3D3"/>
-              <w:end w:val="single" w:space="0" w:color="D3D3D3"/>
-            </w:tcBorders>
-          </w:tcPr>
-          <w:p>
-            <w:pPr>
-              <w:spacing w:before="0" w:after="60"/>
-              <w:keepNext/>
-              <w:jc w:val="start"/>
-            </w:pPr>
-            <w:r>
-              <w:rPr>
-                <w:rFonts w:ascii="Calibri" w:hAnsi="Calibri"/>
-                <w:sz w:val="20"/>
-              </w:rPr>
-              <w:t xml:space="default">0.14</w:t>
+              <w:t xml:space="default">1.06 (0.63 - 1.76)</w:t>
+            </w:r>
+          </w:p>
+        </w:tc>
+        <w:tc>
+          <w:tcPr>
+            <w:tcBorders>
+              <w:top w:val="single" w:space="0" w:color="D3D3D3"/>
+              <w:bottom w:val="single" w:space="0" w:color="D3D3D3"/>
+              <w:start w:val="single" w:space="0" w:color="D3D3D3"/>
+              <w:end w:val="single" w:space="0" w:color="D3D3D3"/>
+            </w:tcBorders>
+          </w:tcPr>
+          <w:p>
+            <w:pPr>
+              <w:spacing w:before="0" w:after="60"/>
+              <w:keepNext/>
+              <w:jc w:val="start"/>
+            </w:pPr>
+            <w:r>
+              <w:rPr>
+                <w:rFonts w:ascii="Calibri" w:hAnsi="Calibri"/>
+                <w:sz w:val="20"/>
+              </w:rPr>
+              <w:t xml:space="default">0.58</w:t>
+            </w:r>
+          </w:p>
+        </w:tc>
+        <w:tc>
+          <w:tcPr>
+            <w:tcBorders>
+              <w:top w:val="single" w:space="0" w:color="D3D3D3"/>
+              <w:bottom w:val="single" w:space="0" w:color="D3D3D3"/>
+              <w:start w:val="single" w:space="0" w:color="D3D3D3"/>
+              <w:end w:val="single" w:space="0" w:color="D3D3D3"/>
+            </w:tcBorders>
+          </w:tcPr>
+          <w:p>
+            <w:pPr>
+              <w:spacing w:before="0" w:after="60"/>
+              <w:keepNext/>
+              <w:jc w:val="start"/>
+            </w:pPr>
+            <w:r>
+              <w:rPr>
+                <w:rFonts w:ascii="Calibri" w:hAnsi="Calibri"/>
+                <w:sz w:val="20"/>
+              </w:rPr>
+              <w:t xml:space="default">0.32</w:t>
+            </w:r>
+          </w:p>
+        </w:tc>
+        <w:tc>
+          <w:tcPr>
+            <w:tcBorders>
+              <w:top w:val="single" w:space="0" w:color="D3D3D3"/>
+              <w:bottom w:val="single" w:space="0" w:color="D3D3D3"/>
+              <w:start w:val="single" w:space="0" w:color="D3D3D3"/>
+              <w:end w:val="single" w:space="0" w:color="D3D3D3"/>
+            </w:tcBorders>
+          </w:tcPr>
+          <w:p>
+            <w:pPr>
+              <w:spacing w:before="0" w:after="60"/>
+              <w:keepNext/>
+              <w:jc w:val="start"/>
+            </w:pPr>
+            <w:r>
+              <w:rPr>
+                <w:rFonts w:ascii="Calibri" w:hAnsi="Calibri"/>
+                <w:sz w:val="20"/>
+              </w:rPr>
+              <w:t xml:space="default">0.15</w:t>
             </w:r>
           </w:p>
         </w:tc>
@@ -1013,7 +1013,7 @@
                 <w:rFonts w:ascii="Calibri" w:hAnsi="Calibri"/>
                 <w:sz w:val="20"/>
               </w:rPr>
-              <w:t xml:space="default">1.01 (0.73 - 1.4)</w:t>
+              <w:t xml:space="default">1.01 (0.72 - 1.39)</w:t>
             </w:r>
           </w:p>
         </w:tc>
@@ -1085,7 +1085,7 @@
                 <w:rFonts w:ascii="Calibri" w:hAnsi="Calibri"/>
                 <w:sz w:val="20"/>
               </w:rPr>
-              <w:t xml:space="default">0.23</w:t>
+              <w:t xml:space="default">0.24</w:t>
             </w:r>
           </w:p>
         </w:tc>
@@ -1187,31 +1187,31 @@
                 <w:rFonts w:ascii="Calibri" w:hAnsi="Calibri"/>
                 <w:sz w:val="20"/>
               </w:rPr>
-              <w:t xml:space="default">0.91 (0.58 - 1.41)</w:t>
-            </w:r>
-          </w:p>
-        </w:tc>
-        <w:tc>
-          <w:tcPr>
-            <w:tcBorders>
-              <w:top w:val="single" w:space="0" w:color="D3D3D3"/>
-              <w:bottom w:val="single" w:space="0" w:color="D3D3D3"/>
-              <w:start w:val="single" w:space="0" w:color="D3D3D3"/>
-              <w:end w:val="single" w:space="0" w:color="D3D3D3"/>
-            </w:tcBorders>
-          </w:tcPr>
-          <w:p>
-            <w:pPr>
-              <w:spacing w:before="0" w:after="60"/>
-              <w:keepNext/>
-              <w:jc w:val="start"/>
-            </w:pPr>
-            <w:r>
-              <w:rPr>
-                <w:rFonts w:ascii="Calibri" w:hAnsi="Calibri"/>
-                <w:sz w:val="20"/>
-              </w:rPr>
-              <w:t xml:space="default">0.34</w:t>
+              <w:t xml:space="default">0.91 (0.59 - 1.42)</w:t>
+            </w:r>
+          </w:p>
+        </w:tc>
+        <w:tc>
+          <w:tcPr>
+            <w:tcBorders>
+              <w:top w:val="single" w:space="0" w:color="D3D3D3"/>
+              <w:bottom w:val="single" w:space="0" w:color="D3D3D3"/>
+              <w:start w:val="single" w:space="0" w:color="D3D3D3"/>
+              <w:end w:val="single" w:space="0" w:color="D3D3D3"/>
+            </w:tcBorders>
+          </w:tcPr>
+          <w:p>
+            <w:pPr>
+              <w:spacing w:before="0" w:after="60"/>
+              <w:keepNext/>
+              <w:jc w:val="start"/>
+            </w:pPr>
+            <w:r>
+              <w:rPr>
+                <w:rFonts w:ascii="Calibri" w:hAnsi="Calibri"/>
+                <w:sz w:val="20"/>
+              </w:rPr>
+              <w:t xml:space="default">0.35</w:t>
             </w:r>
           </w:p>
         </w:tc>
@@ -1361,31 +1361,31 @@
                 <w:rFonts w:ascii="Calibri" w:hAnsi="Calibri"/>
                 <w:sz w:val="20"/>
               </w:rPr>
-              <w:t xml:space="default">1.05 (0.77 - 1.44)</w:t>
-            </w:r>
-          </w:p>
-        </w:tc>
-        <w:tc>
-          <w:tcPr>
-            <w:tcBorders>
-              <w:top w:val="single" w:space="0" w:color="D3D3D3"/>
-              <w:bottom w:val="single" w:space="0" w:color="D3D3D3"/>
-              <w:start w:val="single" w:space="0" w:color="D3D3D3"/>
-              <w:end w:val="single" w:space="0" w:color="D3D3D3"/>
-            </w:tcBorders>
-          </w:tcPr>
-          <w:p>
-            <w:pPr>
-              <w:spacing w:before="0" w:after="60"/>
-              <w:keepNext/>
-              <w:jc w:val="start"/>
-            </w:pPr>
-            <w:r>
-              <w:rPr>
-                <w:rFonts w:ascii="Calibri" w:hAnsi="Calibri"/>
-                <w:sz w:val="20"/>
-              </w:rPr>
-              <w:t xml:space="default">0.62</w:t>
+              <w:t xml:space="default">1.06 (0.77 - 1.44)</w:t>
+            </w:r>
+          </w:p>
+        </w:tc>
+        <w:tc>
+          <w:tcPr>
+            <w:tcBorders>
+              <w:top w:val="single" w:space="0" w:color="D3D3D3"/>
+              <w:bottom w:val="single" w:space="0" w:color="D3D3D3"/>
+              <w:start w:val="single" w:space="0" w:color="D3D3D3"/>
+              <w:end w:val="single" w:space="0" w:color="D3D3D3"/>
+            </w:tcBorders>
+          </w:tcPr>
+          <w:p>
+            <w:pPr>
+              <w:spacing w:before="0" w:after="60"/>
+              <w:keepNext/>
+              <w:jc w:val="start"/>
+            </w:pPr>
+            <w:r>
+              <w:rPr>
+                <w:rFonts w:ascii="Calibri" w:hAnsi="Calibri"/>
+                <w:sz w:val="20"/>
+              </w:rPr>
+              <w:t xml:space="default">0.64</w:t>
             </w:r>
           </w:p>
         </w:tc>
@@ -1433,7 +1433,7 @@
                 <w:rFonts w:ascii="Calibri" w:hAnsi="Calibri"/>
                 <w:sz w:val="20"/>
               </w:rPr>
-              <w:t xml:space="default">0.24</w:t>
+              <w:t xml:space="default">0.23</w:t>
             </w:r>
           </w:p>
         </w:tc>

</xml_diff>